<commit_message>
Rechnung 2026039 im Vorlagenformat mit Netto/MwSt/Brutto
Co-Authored-By: Claude Sonnet 5.5 <noreply@anthropic.com>
Claude-Session: https://claude.ai/code/session_01MQuaNz66opTzN3AP3yBrRn
</commit_message>
<xml_diff>
--- a/Rechnung_2026039_Taschenberger_Real_Estate_GmbH.docx
+++ b/Rechnung_2026039_Taschenberger_Real_Estate_GmbH.docx
@@ -148,36 +148,20 @@
             <w:tcW w:w="5270" w:type="dxa"/>
           </w:tcPr>
           <w:p>
-            <w:proofErr w:type="spellStart"/>
             <w:r>
-              <w:t>Taschenberger</w:t>
-            </w:r>
-            <w:proofErr w:type="spellEnd"/>
-            <w:r>
-              <w:t xml:space="preserve"> Real Estate GmbH</w:t>
+              <w:t xml:space="preserve">Taschenberger Real Estate GmbH</w:t>
             </w:r>
             <w:r>
               <w:br/>
             </w:r>
-            <w:proofErr w:type="spellStart"/>
             <w:r>
-              <w:t>Saßnitzer</w:t>
-            </w:r>
-            <w:proofErr w:type="spellEnd"/>
-            <w:r>
-              <w:t xml:space="preserve"> </w:t>
-            </w:r>
-            <w:proofErr w:type="spellStart"/>
-            <w:r>
-              <w:t>Straße</w:t>
-            </w:r>
-            <w:proofErr w:type="spellEnd"/>
-            <w:r>
-              <w:t xml:space="preserve"> 14</w:t>
+              <w:t xml:space="preserve">Saßnitzer Straße 14</w:t>
             </w:r>
             <w:r>
               <w:br/>
-              <w:t>01109 Dresden</w:t>
+            </w:r>
+            <w:r>
+              <w:t xml:space="preserve">01109 Dresden</w:t>
             </w:r>
           </w:p>
         </w:tc>
@@ -220,35 +204,20 @@
     </w:p>
     <w:p>
       <w:r>
-        <w:t xml:space="preserve">BV </w:t>
-      </w:r>
-      <w:proofErr w:type="spellStart"/>
-      <w:r>
-        <w:t>Ottendorf-Okrilla</w:t>
-      </w:r>
-      <w:proofErr w:type="spellEnd"/>
-      <w:r>
-        <w:br/>
-      </w:r>
-      <w:proofErr w:type="spellStart"/>
-      <w:r>
-        <w:t>Auenstraße</w:t>
-      </w:r>
-      <w:proofErr w:type="spellEnd"/>
-      <w:r>
-        <w:t xml:space="preserve"> 6</w:t>
+        <w:t xml:space="preserve">BV Ottendorf-Okrilla</w:t>
       </w:r>
       <w:r>
         <w:br/>
       </w:r>
       <w:r>
-        <w:t xml:space="preserve">01458 </w:t>
+        <w:t xml:space="preserve">Auenstraße 6</w:t>
       </w:r>
-      <w:proofErr w:type="spellStart"/>
       <w:r>
-        <w:t>Ottendorf-Okrilla</w:t>
+        <w:br/>
       </w:r>
-      <w:proofErr w:type="spellEnd"/>
+      <w:r>
+        <w:t xml:space="preserve">01458 Ottendorf-Okrilla</w:t>
+      </w:r>
     </w:p>
     <w:tbl>
       <w:tblPr>
@@ -376,100 +345,9 @@
             <w:tcW w:w="1757" w:type="dxa"/>
             <w:shd w:val="clear" w:color="auto" w:fill="DCE6F1"/>
           </w:tcPr>
-          <w:p/>
-        </w:tc>
-        <w:tc>
-          <w:tcPr>
-            <w:tcW w:w="1757" w:type="dxa"/>
-            <w:shd w:val="clear" w:color="auto" w:fill="DCE6F1"/>
-          </w:tcPr>
-          <w:p/>
-        </w:tc>
-        <w:tc>
-          <w:tcPr>
-            <w:tcW w:w="1757" w:type="dxa"/>
-            <w:shd w:val="clear" w:color="auto" w:fill="DCE6F1"/>
-          </w:tcPr>
-          <w:p/>
-        </w:tc>
-        <w:tc>
-          <w:tcPr>
-            <w:tcW w:w="1757" w:type="dxa"/>
-            <w:shd w:val="clear" w:color="auto" w:fill="DCE6F1"/>
-          </w:tcPr>
           <w:p>
             <w:r>
-              <w:t>KW 35 / 22.07.2026 - 23.09.2026</w:t>
-            </w:r>
-            <w:r>
-              <w:br/>
-            </w:r>
-            <w:proofErr w:type="spellStart"/>
-            <w:r>
-              <w:t>Giebelfenster</w:t>
-            </w:r>
-            <w:proofErr w:type="spellEnd"/>
-            <w:r>
-              <w:t xml:space="preserve"> </w:t>
-            </w:r>
-            <w:proofErr w:type="spellStart"/>
-            <w:r>
-              <w:t>ausgebaut</w:t>
-            </w:r>
-            <w:proofErr w:type="spellEnd"/>
-            <w:r>
-              <w:t xml:space="preserve">, </w:t>
-            </w:r>
-            <w:proofErr w:type="spellStart"/>
-            <w:r>
-              <w:t>zugemauert</w:t>
-            </w:r>
-            <w:proofErr w:type="spellEnd"/>
-            <w:r>
-              <w:br/>
-            </w:r>
-            <w:proofErr w:type="spellStart"/>
-            <w:r>
-              <w:t>zusätzlich</w:t>
-            </w:r>
-            <w:proofErr w:type="spellEnd"/>
-            <w:r>
-              <w:t xml:space="preserve"> </w:t>
-            </w:r>
-            <w:proofErr w:type="spellStart"/>
-            <w:r>
-              <w:t>streichen</w:t>
-            </w:r>
-            <w:proofErr w:type="spellEnd"/>
-          </w:p>
-        </w:tc>
-        <w:tc>
-          <w:tcPr>
-            <w:tcW w:w="1757" w:type="dxa"/>
-            <w:shd w:val="clear" w:color="auto" w:fill="DCE6F1"/>
-          </w:tcPr>
-          <w:p/>
-        </w:tc>
-        <w:tc>
-          <w:tcPr>
-            <w:tcW w:w="1757" w:type="dxa"/>
-            <w:shd w:val="clear" w:color="auto" w:fill="DCE6F1"/>
-          </w:tcPr>
-          <w:p/>
-        </w:tc>
-      </w:tr>
-      <w:tr>
-        <w:trPr>
-          <w:jc w:val="center"/>
-        </w:trPr>
-        <w:tc>
-          <w:tcPr>
-            <w:tcW w:w="1757" w:type="dxa"/>
-            <w:shd w:val="clear" w:color="auto" w:fill="DCE6F1"/>
-          </w:tcPr>
-          <w:p>
-            <w:r>
-              <w:t>1</w:t>
+              <w:t xml:space="preserve">1</w:t>
             </w:r>
           </w:p>
         </w:tc>
@@ -480,7 +358,7 @@
           </w:tcPr>
           <w:p>
             <w:r>
-              <w:t>11,5</w:t>
+              <w:t xml:space="preserve">11,5</w:t>
             </w:r>
           </w:p>
         </w:tc>
@@ -491,25 +369,7 @@
           </w:tcPr>
           <w:p>
             <w:r>
-              <w:t>Std.</w:t>
-            </w:r>
-          </w:p>
-        </w:tc>
-        <w:tc>
-          <w:tcPr>
-            <w:tcW w:w="1757" w:type="dxa"/>
-            <w:shd w:val="clear" w:color="auto" w:fill="DCE6F1"/>
-          </w:tcPr>
-          <w:p/>
-        </w:tc>
-        <w:tc>
-          <w:tcPr>
-            <w:tcW w:w="1757" w:type="dxa"/>
-            <w:shd w:val="clear" w:color="auto" w:fill="DCE6F1"/>
-          </w:tcPr>
-          <w:p>
-            <w:r>
-              <w:t>25,00 €</w:t>
+              <w:t xml:space="preserve">Std.</w:t>
             </w:r>
           </w:p>
         </w:tc>
@@ -520,7 +380,29 @@
           </w:tcPr>
           <w:p>
             <w:r>
-              <w:t>287,50 €</w:t>
+              <w:t xml:space="preserve">KW 35 / 22.07.2026 - 23.09.2026: Giebelfenster ausgebaut, zugemauert, zusätzlich streichen</w:t>
+            </w:r>
+          </w:p>
+        </w:tc>
+        <w:tc>
+          <w:tcPr>
+            <w:tcW w:w="1757" w:type="dxa"/>
+            <w:shd w:val="clear" w:color="auto" w:fill="DCE6F1"/>
+          </w:tcPr>
+          <w:p>
+            <w:r>
+              <w:t xml:space="preserve">25,00 €</w:t>
+            </w:r>
+          </w:p>
+        </w:tc>
+        <w:tc>
+          <w:tcPr>
+            <w:tcW w:w="1757" w:type="dxa"/>
+            <w:shd w:val="clear" w:color="auto" w:fill="DCE6F1"/>
+          </w:tcPr>
+          <w:p>
+            <w:r>
+              <w:t xml:space="preserve">287,50 €</w:t>
             </w:r>
           </w:p>
         </w:tc>
@@ -535,7 +417,7 @@
           </w:tcPr>
           <w:p>
             <w:r>
-              <w:t>2</w:t>
+              <w:t xml:space="preserve">2</w:t>
             </w:r>
           </w:p>
         </w:tc>
@@ -545,7 +427,7 @@
           </w:tcPr>
           <w:p>
             <w:r>
-              <w:t>1</w:t>
+              <w:t xml:space="preserve">1</w:t>
             </w:r>
           </w:p>
         </w:tc>
@@ -555,7 +437,7 @@
           </w:tcPr>
           <w:p>
             <w:r>
-              <w:t>Stk.</w:t>
+              <w:t xml:space="preserve">Stk.</w:t>
             </w:r>
           </w:p>
         </w:tc>
@@ -564,13 +446,8 @@
             <w:tcW w:w="5386" w:type="dxa"/>
           </w:tcPr>
           <w:p>
-            <w:proofErr w:type="spellStart"/>
             <w:r>
-              <w:t>Zusätzliche</w:t>
-            </w:r>
-            <w:proofErr w:type="spellEnd"/>
-            <w:r>
-              <w:t xml:space="preserve"> Kosten</w:t>
+              <w:t xml:space="preserve">Zusätzliche Kosten</w:t>
             </w:r>
           </w:p>
         </w:tc>
@@ -580,7 +457,7 @@
           </w:tcPr>
           <w:p>
             <w:r>
-              <w:t>55,50 €</w:t>
+              <w:t xml:space="preserve">55,50 €</w:t>
             </w:r>
           </w:p>
         </w:tc>
@@ -590,7 +467,7 @@
           </w:tcPr>
           <w:p>
             <w:r>
-              <w:t>55,50 €</w:t>
+              <w:t xml:space="preserve">55,50 €</w:t>
             </w:r>
           </w:p>
         </w:tc>
@@ -627,7 +504,7 @@
           </w:tcPr>
           <w:p>
             <w:r>
-              <w:t>Summe</w:t>
+              <w:t xml:space="preserve">Summe (netto)</w:t>
             </w:r>
           </w:p>
         </w:tc>
@@ -645,7 +522,7 @@
           </w:tcPr>
           <w:p>
             <w:r>
-              <w:t>343,00 €</w:t>
+              <w:t xml:space="preserve">343,00 €</w:t>
             </w:r>
           </w:p>
         </w:tc>
@@ -681,13 +558,8 @@
             <w:shd w:val="clear" w:color="auto" w:fill="DCE6F1"/>
           </w:tcPr>
           <w:p>
-            <w:proofErr w:type="spellStart"/>
             <w:r>
-              <w:t>Gesamtbetrag</w:t>
-            </w:r>
-            <w:proofErr w:type="spellEnd"/>
-            <w:r>
-              <w:t>:</w:t>
+              <w:t xml:space="preserve">zzgl. 19 % MwSt.</w:t>
             </w:r>
           </w:p>
         </w:tc>
@@ -705,7 +577,62 @@
           </w:tcPr>
           <w:p>
             <w:r>
-              <w:t>343,00 €</w:t>
+              <w:t xml:space="preserve">65,17 €</w:t>
+            </w:r>
+          </w:p>
+        </w:tc>
+      </w:tr>
+      <w:tr>
+        <w:trPr>
+          <w:jc w:val="center"/>
+        </w:trPr>
+        <w:tc>
+          <w:tcPr>
+            <w:tcW w:w="1757" w:type="dxa"/>
+            <w:shd w:val="clear" w:color="auto" w:fill="DCE6F1"/>
+          </w:tcPr>
+          <w:p/>
+        </w:tc>
+        <w:tc>
+          <w:tcPr>
+            <w:tcW w:w="1757" w:type="dxa"/>
+            <w:shd w:val="clear" w:color="auto" w:fill="DCE6F1"/>
+          </w:tcPr>
+          <w:p/>
+        </w:tc>
+        <w:tc>
+          <w:tcPr>
+            <w:tcW w:w="1757" w:type="dxa"/>
+            <w:shd w:val="clear" w:color="auto" w:fill="DCE6F1"/>
+          </w:tcPr>
+          <w:p/>
+        </w:tc>
+        <w:tc>
+          <w:tcPr>
+            <w:tcW w:w="1757" w:type="dxa"/>
+            <w:shd w:val="clear" w:color="auto" w:fill="DCE6F1"/>
+          </w:tcPr>
+          <w:p>
+            <w:r>
+              <w:t xml:space="preserve">Gesamtbetrag (brutto):</w:t>
+            </w:r>
+          </w:p>
+        </w:tc>
+        <w:tc>
+          <w:tcPr>
+            <w:tcW w:w="1757" w:type="dxa"/>
+            <w:shd w:val="clear" w:color="auto" w:fill="DCE6F1"/>
+          </w:tcPr>
+          <w:p/>
+        </w:tc>
+        <w:tc>
+          <w:tcPr>
+            <w:tcW w:w="1757" w:type="dxa"/>
+            <w:shd w:val="clear" w:color="auto" w:fill="DCE6F1"/>
+          </w:tcPr>
+          <w:p>
+            <w:r>
+              <w:t xml:space="preserve">408,17 €</w:t>
             </w:r>
           </w:p>
         </w:tc>

</xml_diff>

<commit_message>
Rechnung 2026039: MwSt-Betrag statt Zusatzposition
Co-Authored-By: Claude Sonnet 5.5 <noreply@anthropic.com>
Claude-Session: https://claude.ai/code/session_01MQuaNz66opTzN3AP3yBrRn
</commit_message>
<xml_diff>
--- a/Rechnung_2026039_Taschenberger_Real_Estate_GmbH.docx
+++ b/Rechnung_2026039_Taschenberger_Real_Estate_GmbH.docx
@@ -413,71 +413,6 @@
         </w:trPr>
         <w:tc>
           <w:tcPr>
-            <w:tcW w:w="680" w:type="dxa"/>
-          </w:tcPr>
-          <w:p>
-            <w:r>
-              <w:t xml:space="preserve">2</w:t>
-            </w:r>
-          </w:p>
-        </w:tc>
-        <w:tc>
-          <w:tcPr>
-            <w:tcW w:w="1134" w:type="dxa"/>
-          </w:tcPr>
-          <w:p>
-            <w:r>
-              <w:t xml:space="preserve">1</w:t>
-            </w:r>
-          </w:p>
-        </w:tc>
-        <w:tc>
-          <w:tcPr>
-            <w:tcW w:w="1134" w:type="dxa"/>
-          </w:tcPr>
-          <w:p>
-            <w:r>
-              <w:t xml:space="preserve">Stk.</w:t>
-            </w:r>
-          </w:p>
-        </w:tc>
-        <w:tc>
-          <w:tcPr>
-            <w:tcW w:w="5386" w:type="dxa"/>
-          </w:tcPr>
-          <w:p>
-            <w:r>
-              <w:t xml:space="preserve">Zusätzliche Kosten</w:t>
-            </w:r>
-          </w:p>
-        </w:tc>
-        <w:tc>
-          <w:tcPr>
-            <w:tcW w:w="1814" w:type="dxa"/>
-          </w:tcPr>
-          <w:p>
-            <w:r>
-              <w:t xml:space="preserve">55,50 €</w:t>
-            </w:r>
-          </w:p>
-        </w:tc>
-        <w:tc>
-          <w:tcPr>
-            <w:tcW w:w="1814" w:type="dxa"/>
-          </w:tcPr>
-          <w:p>
-            <w:r>
-              <w:t xml:space="preserve">55,50 €</w:t>
-            </w:r>
-          </w:p>
-        </w:tc>
-      </w:tr>
-      <w:tr>
-        <w:trPr>
-          <w:jc w:val="center"/>
-        </w:trPr>
-        <w:tc>
-          <w:tcPr>
             <w:tcW w:w="1757" w:type="dxa"/>
             <w:shd w:val="clear" w:color="auto" w:fill="DCE6F1"/>
           </w:tcPr>
@@ -522,7 +457,7 @@
           </w:tcPr>
           <w:p>
             <w:r>
-              <w:t xml:space="preserve">343,00 €</w:t>
+              <w:t xml:space="preserve">287,50 €</w:t>
             </w:r>
           </w:p>
         </w:tc>
@@ -559,7 +494,7 @@
           </w:tcPr>
           <w:p>
             <w:r>
-              <w:t xml:space="preserve">zzgl. 19 % MwSt.</w:t>
+              <w:t xml:space="preserve">zzgl. MwSt.</w:t>
             </w:r>
           </w:p>
         </w:tc>
@@ -577,7 +512,7 @@
           </w:tcPr>
           <w:p>
             <w:r>
-              <w:t xml:space="preserve">65,17 €</w:t>
+              <w:t xml:space="preserve">55,50 €</w:t>
             </w:r>
           </w:p>
         </w:tc>
@@ -632,7 +567,7 @@
           </w:tcPr>
           <w:p>
             <w:r>
-              <w:t xml:space="preserve">408,17 €</w:t>
+              <w:t xml:space="preserve">343,00 €</w:t>
             </w:r>
           </w:p>
         </w:tc>

</xml_diff>